<commit_message>
changes to tech docs
</commit_message>
<xml_diff>
--- a/Docs/Accessibility Analysis System Documentation.docx
+++ b/Docs/Accessibility Analysis System Documentation.docx
@@ -4211,7 +4211,7 @@
           <w:szCs w:val="34"/>
         </w:rPr>
       </w:pPr>
-      <w:bookmarkStart w:name="_mwfvc1nsech" w:id="35"/>
+      <w:bookmarkStart w:name="_fpjllxd47" w:id="35"/>
       <w:bookmarkEnd w:id="35"/>
     </w:p>
     <w:p>
@@ -4227,56 +4227,8 @@
           <w:szCs w:val="34"/>
         </w:rPr>
       </w:pPr>
-      <w:bookmarkStart w:name="_jkvz5w9061hy" w:id="36"/>
+      <w:bookmarkStart w:name="_skug1sabxqy3" w:id="36"/>
       <w:bookmarkEnd w:id="36"/>
-    </w:p>
-    <w:p>
-      <w:pPr>
-        <w:pStyle w:val="Heading 2"/>
-        <w:keepNext w:val="0"/>
-        <w:keepLines w:val="0"/>
-        <w:spacing w:after="80"/>
-        <w:rPr>
-          <w:b w:val="1"/>
-          <w:bCs w:val="1"/>
-          <w:sz w:val="34"/>
-          <w:szCs w:val="34"/>
-        </w:rPr>
-      </w:pPr>
-      <w:bookmarkStart w:name="_s24j97cff6ji" w:id="37"/>
-      <w:bookmarkEnd w:id="37"/>
-    </w:p>
-    <w:p>
-      <w:pPr>
-        <w:pStyle w:val="Heading 2"/>
-        <w:keepNext w:val="0"/>
-        <w:keepLines w:val="0"/>
-        <w:spacing w:after="80"/>
-        <w:rPr>
-          <w:b w:val="1"/>
-          <w:bCs w:val="1"/>
-          <w:sz w:val="34"/>
-          <w:szCs w:val="34"/>
-        </w:rPr>
-      </w:pPr>
-      <w:bookmarkStart w:name="_fpjllxd47" w:id="38"/>
-      <w:bookmarkEnd w:id="38"/>
-    </w:p>
-    <w:p>
-      <w:pPr>
-        <w:pStyle w:val="Heading 2"/>
-        <w:keepNext w:val="0"/>
-        <w:keepLines w:val="0"/>
-        <w:spacing w:after="80"/>
-        <w:rPr>
-          <w:b w:val="1"/>
-          <w:bCs w:val="1"/>
-          <w:sz w:val="34"/>
-          <w:szCs w:val="34"/>
-        </w:rPr>
-      </w:pPr>
-      <w:bookmarkStart w:name="_skug1sabxqy3" w:id="39"/>
-      <w:bookmarkEnd w:id="39"/>
       <w:r>
         <w:rPr>
           <w:b w:val="1"/>
@@ -4320,8 +4272,8 @@
           </w14:textFill>
         </w:rPr>
       </w:pPr>
-      <w:bookmarkStart w:name="_yvhrszki07de" w:id="40"/>
-      <w:bookmarkEnd w:id="40"/>
+      <w:bookmarkStart w:name="_yvhrszki07de" w:id="37"/>
+      <w:bookmarkEnd w:id="37"/>
       <w:r>
         <w:rPr>
           <w:b w:val="1"/>
@@ -4503,8 +4455,8 @@
           </w14:textFill>
         </w:rPr>
       </w:pPr>
-      <w:bookmarkStart w:name="_qhn3dc29f7" w:id="41"/>
-      <w:bookmarkEnd w:id="41"/>
+      <w:bookmarkStart w:name="_qhn3dc29f7" w:id="38"/>
+      <w:bookmarkEnd w:id="38"/>
       <w:r>
         <w:rPr>
           <w:b w:val="1"/>
@@ -4553,7 +4505,7 @@
           <w:rtl w:val="0"/>
           <w:lang w:val="en-US"/>
         </w:rPr>
-        <w:t>react-accessibility-app/</w:t>
+        <w:t>accessibility-app/</w:t>
       </w:r>
     </w:p>
     <w:p>
@@ -4975,8 +4927,8 @@
           </w14:textFill>
         </w:rPr>
       </w:pPr>
-      <w:bookmarkStart w:name="_p2nmowyiv140" w:id="42"/>
-      <w:bookmarkEnd w:id="42"/>
+      <w:bookmarkStart w:name="_p2nmowyiv140" w:id="39"/>
+      <w:bookmarkEnd w:id="39"/>
       <w:r>
         <w:rPr>
           <w:b w:val="1"/>
@@ -5249,8 +5201,8 @@
           </w14:textFill>
         </w:rPr>
       </w:pPr>
-      <w:bookmarkStart w:name="_fxqga8pp55" w:id="43"/>
-      <w:bookmarkEnd w:id="43"/>
+      <w:bookmarkStart w:name="_fxqga8pp55" w:id="40"/>
+      <w:bookmarkEnd w:id="40"/>
     </w:p>
     <w:p>
       <w:pPr>
@@ -5295,8 +5247,8 @@
           </w14:textFill>
         </w:rPr>
       </w:pPr>
-      <w:bookmarkStart w:name="_qj18p7y5aozl" w:id="44"/>
-      <w:bookmarkEnd w:id="44"/>
+      <w:bookmarkStart w:name="_qj18p7y5aozl" w:id="41"/>
+      <w:bookmarkEnd w:id="41"/>
       <w:r>
         <w:rPr>
           <w:b w:val="1"/>
@@ -5542,15 +5494,19 @@
         <w:keepNext w:val="0"/>
         <w:keepLines w:val="0"/>
         <w:spacing w:after="80"/>
+      </w:pPr>
+      <w:bookmarkStart w:name="_l2zzqfgontow" w:id="42"/>
+      <w:bookmarkEnd w:id="42"/>
+      <w:r>
         <w:rPr>
           <w:b w:val="1"/>
           <w:bCs w:val="1"/>
           <w:sz w:val="34"/>
           <w:szCs w:val="34"/>
-        </w:rPr>
-      </w:pPr>
-      <w:bookmarkStart w:name="_l2zzqfgontow" w:id="45"/>
-      <w:bookmarkEnd w:id="45"/>
+          <w:rtl w:val="0"/>
+        </w:rPr>
+        <w:t>6</w:t>
+      </w:r>
       <w:r>
         <w:rPr>
           <w:b w:val="1"/>
@@ -5558,71 +5514,9 @@
           <w:sz w:val="34"/>
           <w:szCs w:val="34"/>
           <w:rtl w:val="0"/>
-        </w:rPr>
-        <w:t>6</w:t>
-      </w:r>
-      <w:r>
-        <w:rPr>
-          <w:b w:val="1"/>
-          <w:bCs w:val="1"/>
-          <w:sz w:val="34"/>
-          <w:szCs w:val="34"/>
-          <w:rtl w:val="0"/>
           <w:lang w:val="en-US"/>
         </w:rPr>
         <w:t>. Setup and Installation</w:t>
-      </w:r>
-    </w:p>
-    <w:p>
-      <w:pPr>
-        <w:pStyle w:val="Body A"/>
-      </w:pPr>
-      <w:r>
-        <w:rPr>
-          <w:b w:val="1"/>
-          <w:bCs w:val="1"/>
-          <w:rtl w:val="0"/>
-          <w:lang w:val="en-US"/>
-        </w:rPr>
-        <w:t>Clone the Repository</w:t>
-      </w:r>
-      <w:r>
-        <w:rPr>
-          <w:rStyle w:val="None A"/>
-          <w:rtl w:val="0"/>
-          <w:lang w:val="en-US"/>
-        </w:rPr>
-        <w:t>:</w:t>
-      </w:r>
-      <w:r>
-        <w:rPr>
-          <w:rStyle w:val="None A"/>
-          <w:rtl w:val="0"/>
-        </w:rPr>
-        <w:br w:type="textWrapping"/>
-        <w:br w:type="textWrapping"/>
-        <w:t xml:space="preserve"> </w:t>
-      </w:r>
-      <w:r>
-        <w:rPr>
-          <w:rStyle w:val="None A"/>
-          <w:rtl w:val="0"/>
-          <w:lang w:val="en-US"/>
-        </w:rPr>
-        <w:t>git clone https://github.com/yourusername/react-accessibility-app.git</w:t>
-      </w:r>
-    </w:p>
-    <w:p>
-      <w:pPr>
-        <w:pStyle w:val="Body A"/>
-      </w:pPr>
-      <w:r>
-        <w:rPr>
-          <w:rStyle w:val="None A"/>
-          <w:rtl w:val="0"/>
-          <w:lang w:val="en-US"/>
-        </w:rPr>
-        <w:t>cd react-accessibility-app</w:t>
       </w:r>
     </w:p>
     <w:p>
@@ -5959,8 +5853,8 @@
           </mc:Fallback>
         </mc:AlternateContent>
       </w:r>
-      <w:bookmarkStart w:name="_j78ux2niuos" w:id="46"/>
-      <w:bookmarkEnd w:id="46"/>
+      <w:bookmarkStart w:name="_j78ux2niuos" w:id="43"/>
+      <w:bookmarkEnd w:id="43"/>
     </w:p>
     <w:p>
       <w:pPr>
@@ -5975,8 +5869,22 @@
           <w:szCs w:val="34"/>
         </w:rPr>
       </w:pPr>
-      <w:bookmarkStart w:name="_tuutvkupac13" w:id="47"/>
-      <w:bookmarkEnd w:id="47"/>
+    </w:p>
+    <w:p>
+      <w:pPr>
+        <w:pStyle w:val="Heading 2"/>
+        <w:keepNext w:val="0"/>
+        <w:keepLines w:val="0"/>
+        <w:spacing w:after="80"/>
+        <w:rPr>
+          <w:b w:val="1"/>
+          <w:bCs w:val="1"/>
+          <w:sz w:val="34"/>
+          <w:szCs w:val="34"/>
+        </w:rPr>
+      </w:pPr>
+      <w:bookmarkStart w:name="_tuutvkupac13" w:id="44"/>
+      <w:bookmarkEnd w:id="44"/>
       <w:r>
         <w:rPr>
           <w:b w:val="1"/>
@@ -6153,31 +6061,7 @@
           <w:rtl w:val="0"/>
           <w:lang w:val="en-US"/>
         </w:rPr>
-        <w:t xml:space="preserve"> directory (or alongside components/pages using a </w:t>
-      </w:r>
-      <w:r>
-        <w:rPr>
-          <w:rFonts w:ascii="Roboto Mono" w:cs="Roboto Mono" w:hAnsi="Roboto Mono" w:eastAsia="Roboto Mono"/>
-          <w:outline w:val="0"/>
-          <w:color w:val="188038"/>
-          <w:u w:color="188038"/>
-          <w:rtl w:val="0"/>
-          <w:lang w:val="en-US"/>
-          <w14:textFill>
-            <w14:solidFill>
-              <w14:srgbClr w14:val="188038"/>
-            </w14:solidFill>
-          </w14:textFill>
-        </w:rPr>
-        <w:t>.test.tsx</w:t>
-      </w:r>
-      <w:r>
-        <w:rPr>
-          <w:rStyle w:val="None A"/>
-          <w:rtl w:val="0"/>
-          <w:lang w:val="en-US"/>
-        </w:rPr>
-        <w:t xml:space="preserve"> extension).</w:t>
+        <w:t xml:space="preserve"> directory </w:t>
       </w:r>
     </w:p>
     <w:p>
@@ -6188,7 +6072,7 @@
           <w:numId w:val="30"/>
         </w:numPr>
         <w:bidi w:val="0"/>
-        <w:spacing w:after="240"/>
+        <w:spacing w:before="240"/>
         <w:ind w:right="0"/>
         <w:jc w:val="left"/>
         <w:rPr>
@@ -6303,8 +6187,8 @@
           <w:szCs w:val="34"/>
         </w:rPr>
       </w:pPr>
-      <w:bookmarkStart w:name="_kwpa0ocsojq7" w:id="48"/>
-      <w:bookmarkEnd w:id="48"/>
+      <w:bookmarkStart w:name="_kwpa0ocsojq7" w:id="45"/>
+      <w:bookmarkEnd w:id="45"/>
       <w:r>
         <w:rPr>
           <w:b w:val="1"/>
@@ -6684,8 +6568,8 @@
           </mc:Fallback>
         </mc:AlternateContent>
       </w:r>
-      <w:bookmarkStart w:name="_ijeik9vkbfoj" w:id="49"/>
-      <w:bookmarkEnd w:id="49"/>
+      <w:bookmarkStart w:name="_ijeik9vkbfoj" w:id="46"/>
+      <w:bookmarkEnd w:id="46"/>
     </w:p>
     <w:p>
       <w:pPr>
@@ -6698,11 +6582,67 @@
           <w:bCs w:val="1"/>
           <w:sz w:val="34"/>
           <w:szCs w:val="34"/>
+        </w:rPr>
+      </w:pPr>
+    </w:p>
+    <w:p>
+      <w:pPr>
+        <w:pStyle w:val="Heading 2"/>
+        <w:keepNext w:val="0"/>
+        <w:keepLines w:val="0"/>
+        <w:spacing w:after="80"/>
+        <w:rPr>
+          <w:b w:val="1"/>
+          <w:bCs w:val="1"/>
+          <w:sz w:val="34"/>
+          <w:szCs w:val="34"/>
+        </w:rPr>
+      </w:pPr>
+    </w:p>
+    <w:p>
+      <w:pPr>
+        <w:pStyle w:val="Heading 2"/>
+        <w:keepNext w:val="0"/>
+        <w:keepLines w:val="0"/>
+        <w:spacing w:after="80"/>
+        <w:rPr>
+          <w:b w:val="1"/>
+          <w:bCs w:val="1"/>
+          <w:sz w:val="34"/>
+          <w:szCs w:val="34"/>
+        </w:rPr>
+      </w:pPr>
+    </w:p>
+    <w:p>
+      <w:pPr>
+        <w:pStyle w:val="Heading 2"/>
+        <w:keepNext w:val="0"/>
+        <w:keepLines w:val="0"/>
+        <w:spacing w:after="80"/>
+        <w:rPr>
+          <w:b w:val="1"/>
+          <w:bCs w:val="1"/>
+          <w:sz w:val="34"/>
+          <w:szCs w:val="34"/>
+        </w:rPr>
+      </w:pPr>
+    </w:p>
+    <w:p>
+      <w:pPr>
+        <w:pStyle w:val="Heading 2"/>
+        <w:keepNext w:val="0"/>
+        <w:keepLines w:val="0"/>
+        <w:spacing w:after="80"/>
+        <w:rPr>
+          <w:b w:val="1"/>
+          <w:bCs w:val="1"/>
+          <w:sz w:val="34"/>
+          <w:szCs w:val="34"/>
           <w:lang w:val="fr-FR"/>
         </w:rPr>
       </w:pPr>
-      <w:bookmarkStart w:name="_lcxhic6lcwaj" w:id="50"/>
-      <w:bookmarkEnd w:id="50"/>
+      <w:bookmarkStart w:name="_lcxhic6lcwaj" w:id="47"/>
+      <w:bookmarkEnd w:id="47"/>
       <w:r>
         <w:rPr>
           <w:b w:val="1"/>

</xml_diff>